<commit_message>
Fix project GitHub links, attach Web Developer CV to Hero section
</commit_message>
<xml_diff>
--- a/public/CV_Eman_Ilyas (7).docx
+++ b/public/CV_Eman_Ilyas (7).docx
@@ -41,7 +41,7 @@
         <w:spacing w:after="60"/>
         <w:jc w:val="center"/>
       </w:pPr>
-      <w:hyperlink w:history="1" r:id="rId3gigp_nmo-7cax2w_dglq">
+      <w:hyperlink w:history="1" r:id="rIdrsdquahn5dzrzobsua3ku">
         <w:r>
           <w:rPr>
             <w:rFonts w:ascii="Calibri" w:cs="Calibri" w:eastAsia="Calibri" w:hAnsi="Calibri"/>
@@ -61,7 +61,7 @@
         </w:rPr>
         <w:t xml:space="preserve">   •   </w:t>
       </w:r>
-      <w:hyperlink w:history="1" r:id="rIdxfulebzz-8sbxwgbb-nqg">
+      <w:hyperlink w:history="1" r:id="rIdm-kv12ov9otfrl2h5plz0">
         <w:r>
           <w:rPr>
             <w:rFonts w:ascii="Calibri" w:cs="Calibri" w:eastAsia="Calibri" w:hAnsi="Calibri"/>
@@ -96,7 +96,7 @@
         <w:spacing w:after="120"/>
         <w:jc w:val="center"/>
       </w:pPr>
-      <w:hyperlink w:history="1" r:id="rIdnort3fidjsm1ty82r3hnm">
+      <w:hyperlink w:history="1" r:id="rIdrnk1blvqdiio2y2phia2n">
         <w:r>
           <w:rPr>
             <w:rFonts w:ascii="Calibri" w:cs="Calibri" w:eastAsia="Calibri" w:hAnsi="Calibri"/>
@@ -105,7 +105,7 @@
             <w:szCs w:val="19"/>
             <w:u w:val="single"/>
           </w:rPr>
-          <w:t xml:space="preserve">github.com/emanilyas</w:t>
+          <w:t xml:space="preserve">github.com/E-man474</w:t>
         </w:r>
       </w:hyperlink>
       <w:r>
@@ -116,7 +116,7 @@
         </w:rPr>
         <w:t xml:space="preserve">   •   </w:t>
       </w:r>
-      <w:hyperlink w:history="1" r:id="rId4d0nrw3_b00_g7sle__bb">
+      <w:hyperlink w:history="1" r:id="rIdck9w9ve539dhg-0i9puix">
         <w:r>
           <w:rPr>
             <w:rFonts w:ascii="Calibri" w:cs="Calibri" w:eastAsia="Calibri" w:hAnsi="Calibri"/>
@@ -672,7 +672,7 @@
       <w:pPr>
         <w:spacing w:after="100"/>
       </w:pPr>
-      <w:hyperlink w:history="1" r:id="rIdkqwx3mosw5cs1swsiksq5">
+      <w:hyperlink w:history="1" r:id="rIdkjgqeickuis1hqiu-r-ru">
         <w:r>
           <w:rPr>
             <w:rFonts w:ascii="Calibri" w:cs="Calibri" w:eastAsia="Calibri" w:hAnsi="Calibri"/>
@@ -691,7 +691,7 @@
         </w:rPr>
         <w:t xml:space="preserve">   </w:t>
       </w:r>
-      <w:hyperlink w:history="1" r:id="rIdeqiwj9pif3-lnjg1_krib">
+      <w:hyperlink w:history="1" r:id="rId-elgobxzs_fsb5efqmtpo">
         <w:r>
           <w:rPr>
             <w:rFonts w:ascii="Calibri" w:cs="Calibri" w:eastAsia="Calibri" w:hAnsi="Calibri"/>
@@ -700,7 +700,7 @@
             <w:szCs w:val="19"/>
             <w:u w:val="single"/>
           </w:rPr>
-          <w:t xml:space="preserve">GitHub: github.com/emanilyas/cleangermany-website</w:t>
+          <w:t xml:space="preserve">GitHub: github.com/E-man474/cleangermany-website</w:t>
         </w:r>
       </w:hyperlink>
     </w:p>
@@ -792,7 +792,7 @@
       <w:pPr>
         <w:spacing w:after="100"/>
       </w:pPr>
-      <w:hyperlink w:history="1" r:id="rIdvwxv3twodrlj2vio06mzo">
+      <w:hyperlink w:history="1" r:id="rIdvdwwlolxvvyk5gwyl_xyz">
         <w:r>
           <w:rPr>
             <w:rFonts w:ascii="Calibri" w:cs="Calibri" w:eastAsia="Calibri" w:hAnsi="Calibri"/>
@@ -811,7 +811,7 @@
         </w:rPr>
         <w:t xml:space="preserve">   </w:t>
       </w:r>
-      <w:hyperlink w:history="1" r:id="rId-iksndcmrzz07xcrjupjm">
+      <w:hyperlink w:history="1" r:id="rIdg2yejtktwqjz6upue2uby">
         <w:r>
           <w:rPr>
             <w:rFonts w:ascii="Calibri" w:cs="Calibri" w:eastAsia="Calibri" w:hAnsi="Calibri"/>
@@ -820,7 +820,7 @@
             <w:szCs w:val="19"/>
             <w:u w:val="single"/>
           </w:rPr>
-          <w:t xml:space="preserve">GitHub: github.com/emanilyas/expense-tracker</w:t>
+          <w:t xml:space="preserve">GitHub: github.com/E-man474/Expense-Tracker</w:t>
         </w:r>
       </w:hyperlink>
     </w:p>
@@ -931,7 +931,7 @@
       <w:pPr>
         <w:spacing w:after="100"/>
       </w:pPr>
-      <w:hyperlink w:history="1" r:id="rId9vlv8q_d38sutc7nih7lp">
+      <w:hyperlink w:history="1" r:id="rIdtldqrwhxlsjvqosihnkvc">
         <w:r>
           <w:rPr>
             <w:rFonts w:ascii="Calibri" w:cs="Calibri" w:eastAsia="Calibri" w:hAnsi="Calibri"/>
@@ -950,7 +950,7 @@
         </w:rPr>
         <w:t xml:space="preserve">   </w:t>
       </w:r>
-      <w:hyperlink w:history="1" r:id="rIdv0m6ejirlr4exgqiwk25t">
+      <w:hyperlink w:history="1" r:id="rId7zo3ohw1c6k_1l2fu0clq">
         <w:r>
           <w:rPr>
             <w:rFonts w:ascii="Calibri" w:cs="Calibri" w:eastAsia="Calibri" w:hAnsi="Calibri"/>
@@ -959,7 +959,7 @@
             <w:szCs w:val="19"/>
             <w:u w:val="single"/>
           </w:rPr>
-          <w:t xml:space="preserve">GitHub: github.com/emanilyas/portfolio</w:t>
+          <w:t xml:space="preserve">GitHub: github.com/E-man474/Portfolio</w:t>
         </w:r>
       </w:hyperlink>
     </w:p>

</xml_diff>